<commit_message>
chore(artwork): harmonize figure notations with final paper manuscript
</commit_message>
<xml_diff>
--- a/results/submission_package/Figure_Captions.docx
+++ b/results/submission_package/Figure_Captions.docx
@@ -62,7 +62,7 @@
           <w:rFonts w:ascii="Arial" w:hAnsi="Arial"/>
           <w:sz w:val="22"/>
         </w:rPr>
-        <w:t>Stage 1 latent cluster optimization curves across candidate sub-population counts $K \in [2, 10]$: (a) Davies–Bouldin index and composite cost function $f(n)$ showing global cost minimum at $K=2$; (b) Calinski–Harabasz variance ratio criterion exhibiting peak sub-population separation at $K=2$.</w:t>
+        <w:t>Stage 1 latent cluster optimization curves across candidate sub-population counts $K \in [2, 10]$: (a) Davies–Bouldin index and composite score $\text{Composite}(K)$ showing global cost minimum at $K=2$; (b) Calinski–Harabasz variance ratio criterion exhibiting peak sub-population separation at $K=2$.</w:t>
       </w:r>
     </w:p>
     <w:p>
@@ -96,7 +96,7 @@
           <w:rFonts w:ascii="Arial" w:hAnsi="Arial"/>
           <w:sz w:val="22"/>
         </w:rPr>
-        <w:t>Sensitivity heatmap of predictive and fairness metrics across fairness regularization weights $\lambda_{\text{fairness}} \in [0.1, 50.0]$ in the pipeline objective formulation.</w:t>
+        <w:t>Sensitivity heatmap of predictive and fairness metrics across fairness regularization weights $\lambda \in [0.1, 50.0]$ in the pipeline objective formulation.</w:t>
       </w:r>
     </w:p>
     <w:p>

</xml_diff>